<commit_message>
Replace collaboration demo default contract
</commit_message>
<xml_diff>
--- a/canonical-collaboration-demo/server/assets/contract.docx
+++ b/canonical-collaboration-demo/server/assets/contract.docx
@@ -201,27 +201,13 @@
         <w:rPr>
           <w:color w:val="000000"/>
         </w:rPr>
-        <w:t xml:space="preserve">traditional </w:t>
-      </w:r>
-      <w:sdt>
-        <w:sdtPr>
-          <w:alias w:val="interface_type"/>
-          <w:tag w:val="interface_type"/>
-          <w:id w:val="1990282937"/>
-        </w:sdtPr>
-        <w:sdtContent>
-          <w:ins w:id="2" w:author="Default SuperDoc user" w:date="2026-02-11T19:10:00Z">
-            <w:r>
-              <w:rPr>
-                <w:color w:val="000000"/>
-              </w:rPr>
-              <w:t>WYSIWYG</w:t>
-            </w:r>
-          </w:ins>
-        </w:sdtContent>
-      </w:sdt>
+        <w:t>traditional</w:t>
+      </w:r>
       <w:r>
         <w:t xml:space="preserve"> </w:t>
+      </w:r>
+      <w:r>
+        <w:t xml:space="preserve">WYSIWYG </w:t>
       </w:r>
       <w:r>
         <w:rPr>
@@ -268,7 +254,7 @@
         </w:rPr>
         <w:t xml:space="preserve"> the Party envisioned a future where document </w:t>
       </w:r>
-      <w:del w:id="3" w:author="Default SuperDoc user" w:date="2026-02-12T18:40:00Z">
+      <w:del w:id="2" w:author="Default SuperDoc user" w:date="2026-02-12T18:40:00Z">
         <w:r>
           <w:rPr>
             <w:color w:val="000000"/>
@@ -276,7 +262,7 @@
           <w:delText xml:space="preserve">get/load </w:delText>
         </w:r>
       </w:del>
-      <w:ins w:id="4" w:author="Default SuperDoc user" w:date="2026-02-12T18:40:00Z">
+      <w:ins w:id="3" w:author="Default SuperDoc user" w:date="2026-02-12T18:40:00Z">
         <w:r>
           <w:rPr>
             <w:color w:val="000000"/>
@@ -992,11 +978,11 @@
       <w:r>
         <w:t xml:space="preserve">— </w:t>
       </w:r>
-      <w:commentRangeStart w:id="5"/>
+      <w:commentRangeStart w:id="4"/>
       <w:r>
         <w:t>SuperDoc can fully run entirely in the browser or entirely on the server as a JavaScript library with enhanced TypeScript safety and modern developer experience.</w:t>
       </w:r>
-      <w:commentRangeEnd w:id="5"/>
+      <w:commentRangeEnd w:id="4"/>
       <w:r>
         <w:rPr>
           <w:rStyle w:val="CommentReference"/>
@@ -1006,7 +992,7 @@
           <w:sz w:val="22"/>
           <w:szCs w:val="22"/>
         </w:rPr>
-        <w:commentReference w:id="5"/>
+        <w:commentReference w:id="4"/>
       </w:r>
     </w:p>
     <w:p>
@@ -2038,7 +2024,7 @@
 
 <file path=word/comments.xml><?xml version="1.0" encoding="utf-8"?>
 <w:comments xmlns:wpc="http://schemas.microsoft.com/office/word/2010/wordprocessingCanvas" xmlns:cx="http://schemas.microsoft.com/office/drawing/2014/chartex" xmlns:cx1="http://schemas.microsoft.com/office/drawing/2015/9/8/chartex" xmlns:cx2="http://schemas.microsoft.com/office/drawing/2015/10/21/chartex" xmlns:cx3="http://schemas.microsoft.com/office/drawing/2016/5/9/chartex" xmlns:cx4="http://schemas.microsoft.com/office/drawing/2016/5/10/chartex" xmlns:cx5="http://schemas.microsoft.com/office/drawing/2016/5/11/chartex" xmlns:cx6="http://schemas.microsoft.com/office/drawing/2016/5/12/chartex" xmlns:cx7="http://schemas.microsoft.com/office/drawing/2016/5/13/chartex" xmlns:cx8="http://schemas.microsoft.com/office/drawing/2016/5/14/chartex" xmlns:mc="http://schemas.openxmlformats.org/markup-compatibility/2006" xmlns:m="http://schemas.openxmlformats.org/officeDocument/2006/math" xmlns:aink="http://schemas.microsoft.com/office/drawing/2016/ink" xmlns:am3d="http://schemas.microsoft.com/office/drawing/2017/model3d" xmlns:oel="http://schemas.microsoft.com/office/2019/extlst" xmlns:r="http://schemas.openxmlformats.org/officeDocument/2006/relationships" xmlns:wp14="http://schemas.microsoft.com/office/word/2010/wordprocessingDrawing" xmlns:wp="http://schemas.openxmlformats.org/drawingml/2006/wordprocessingDrawing" xmlns:wpg="http://schemas.microsoft.com/office/word/2010/wordprocessingGroup" xmlns:wpi="http://schemas.microsoft.com/office/word/2010/wordprocessingInk" xmlns:wps="http://schemas.microsoft.com/office/word/2010/wordprocessingShape" xmlns:o="urn:schemas-microsoft-com:office:office" xmlns:v="urn:schemas-microsoft-com:vml" xmlns:w10="urn:schemas-microsoft-com:office:word" xmlns:w="http://schemas.openxmlformats.org/wordprocessingml/2006/main" xmlns:w14="http://schemas.microsoft.com/office/word/2010/wordml" xmlns:w15="http://schemas.microsoft.com/office/word/2012/wordml" xmlns:w16cex="http://schemas.microsoft.com/office/word/2018/wordml/cex" xmlns:w16cid="http://schemas.microsoft.com/office/word/2016/wordml/cid" xmlns:w16="http://schemas.microsoft.com/office/word/2018/wordml" xmlns:w16sdtdh="http://schemas.microsoft.com/office/word/2020/wordml/sdtdatahash" xmlns:w16sdtfl="http://schemas.microsoft.com/office/word/2024/wordml/sdtformatlock" xmlns:w16se="http://schemas.microsoft.com/office/word/2015/wordml/symex" xmlns:w16du="http://schemas.microsoft.com/office/word/2023/wordml/word16du" xmlns:wne="http://schemas.microsoft.com/office/word/2006/wordml" mc:Ignorable="w14 w15 w16se w16cid w16 w16cex w16sdtdh w16sdtfl w16du wp14">
-  <w:comment w:id="5" w:author="Eric Doversberger" w:date="2026-09-21T14:41:00Z" w:initials="ED">
+  <w:comment w:id="4" w:author="Eric Doversberger" w:date="2026-09-21T14:41:00Z" w:initials="ED">
     <w:p>
       <w:r>
         <w:rPr>

</xml_diff>